<commit_message>
feat(calculus): add two-layer figure (fig1) inline to E&IA Essay version
Co-Authored-By: Tatsuki Onishi <bougtoir@gmail.com>
</commit_message>
<xml_diff>
--- a/calculus_of_lives/output/essay_en.docx
+++ b/calculus_of_lives/output/essay_en.docx
@@ -58,7 +58,59 @@
         <w:ind w:firstLine="576"/>
       </w:pPr>
       <w:r>
-        <w:t>Call this a shift in the layer of the question. The “was it necessary?” debate operates inside the calculus; it audits a weighing whose legitimacy it never examines. The question I want to press sits outside the calculus and asks whether we are entitled to perform it at all. The two layers are independent: one can win every point on the inner layer—concede that the sums add up—and still have said nothing to the outer one. Much of what passes for moral debate about the bomb, and about war in general, is an argument on the inner layer mistaken for an argument on the outer. And which layer a society instinctively reaches for tells us what it already takes for granted about the standing of persons. The same doubling holds for war in any of its forms, including the quieter ones: economic coercion and cultural domination are also ways of securing one's own flourishing by drawing down another's, and they too invite both questions.</w:t>
+        <w:t>Call this a shift in the layer of the question (Figure 1). The “was it necessary?” debate operates inside the calculus; it audits a weighing whose legitimacy it never examines. The question I want to press sits outside the calculus and asks whether we are entitled to perform it at all. The two layers are independent: one can win every point on the inner layer—concede that the sums add up—and still have said nothing to the outer one. Much of what passes for moral debate about the bomb, and about war in general, is an argument on the inner layer mistaken for an argument on the outer. And which layer a society instinctively reaches for tells us what it already takes for granted about the standing of persons. The same doubling holds for war in any of its forms, including the quieter ones: economic coercion and cultural domination are also ways of securing one's own flourishing by drawing down another's, and they too invite both questions.</w:t>
+      </w:r>
+    </w:p>
+    <w:p>
+      <w:pPr>
+        <w:spacing w:before="240"/>
+        <w:jc w:val="center"/>
+      </w:pPr>
+      <w:r>
+        <w:drawing>
+          <wp:inline xmlns:a="http://schemas.openxmlformats.org/drawingml/2006/main" xmlns:pic="http://schemas.openxmlformats.org/drawingml/2006/picture">
+            <wp:extent cx="4937760" cy="3195021"/>
+            <wp:docPr id="1" name="Picture 1"/>
+            <wp:cNvGraphicFramePr>
+              <a:graphicFrameLocks noChangeAspect="1"/>
+            </wp:cNvGraphicFramePr>
+            <a:graphic>
+              <a:graphicData uri="http://schemas.openxmlformats.org/drawingml/2006/picture">
+                <pic:pic>
+                  <pic:nvPicPr>
+                    <pic:cNvPr id="0" name="fig1_layers.png"/>
+                    <pic:cNvPicPr/>
+                  </pic:nvPicPr>
+                  <pic:blipFill>
+                    <a:blip r:embed="rId9"/>
+                    <a:stretch>
+                      <a:fillRect/>
+                    </a:stretch>
+                  </pic:blipFill>
+                  <pic:spPr>
+                    <a:xfrm>
+                      <a:off x="0" y="0"/>
+                      <a:ext cx="4937760" cy="3195021"/>
+                    </a:xfrm>
+                    <a:prstGeom prst="rect"/>
+                  </pic:spPr>
+                </pic:pic>
+              </a:graphicData>
+            </a:graphic>
+          </wp:inline>
+        </w:drawing>
+      </w:r>
+    </w:p>
+    <w:p>
+      <w:pPr>
+        <w:spacing w:before="120" w:after="160" w:line="240" w:lineRule="auto"/>
+        <w:jc w:val="center"/>
+      </w:pPr>
+      <w:r>
+        <w:rPr>
+          <w:sz w:val="20"/>
+        </w:rPr>
+        <w:t>Figure 1. Two layers of the question. The inner layer audits a weighing whose legitimacy it takes for granted (“was the bomb necessary?”); the outer layer asks whether we are entitled to perform the weighing at all. One can win every point on the inner layer and have said nothing to the outer one.</w:t>
       </w:r>
     </w:p>
     <w:p>

</xml_diff>

<commit_message>
feat(calculus): redraw Figure 1 as a funnel/sieve (preconception filters out the outer question)
Co-Authored-By: Tatsuki Onishi <bougtoir@gmail.com>
</commit_message>
<xml_diff>
--- a/calculus_of_lives/output/essay_en.docx
+++ b/calculus_of_lives/output/essay_en.docx
@@ -69,7 +69,7 @@
       <w:r>
         <w:drawing>
           <wp:inline xmlns:a="http://schemas.openxmlformats.org/drawingml/2006/main" xmlns:pic="http://schemas.openxmlformats.org/drawingml/2006/picture">
-            <wp:extent cx="4937760" cy="3195021"/>
+            <wp:extent cx="4937760" cy="4315072"/>
             <wp:docPr id="1" name="Picture 1"/>
             <wp:cNvGraphicFramePr>
               <a:graphicFrameLocks noChangeAspect="1"/>
@@ -90,7 +90,7 @@
                   <pic:spPr>
                     <a:xfrm>
                       <a:off x="0" y="0"/>
-                      <a:ext cx="4937760" cy="3195021"/>
+                      <a:ext cx="4937760" cy="4315072"/>
                     </a:xfrm>
                     <a:prstGeom prst="rect"/>
                   </pic:spPr>
@@ -110,7 +110,7 @@
         <w:rPr>
           <w:sz w:val="20"/>
         </w:rPr>
-        <w:t>Figure 1. Two layers of the question. The inner layer audits a weighing whose legitimacy it takes for granted (“was the bomb necessary?”); the outer layer asks whether we are entitled to perform the weighing at all. One can win every point on the inner layer and have said nothing to the outer one.</w:t>
+        <w:t>Figure 1. The funnel of attention. Every question the bombing raises pours in at the top, but a layer of common sense and preconception—that we are entitled to do the weighing—acts as a sieve: only the inner, technical question (“was it necessary?”) passes through into public debate, while the outer question—whether such weighing is ours to perform at all—is screened out and never comes into view.</w:t>
       </w:r>
     </w:p>
     <w:p>

</xml_diff>

<commit_message>
essay: soften overstated claims; add E&IA submission package builder
Co-Authored-By: Tatsuki Onishi <bougtoir@gmail.com>
</commit_message>
<xml_diff>
--- a/calculus_of_lives/output/essay_en.docx
+++ b/calculus_of_lives/output/essay_en.docx
@@ -320,7 +320,7 @@
         <w:ind w:firstLine="576"/>
       </w:pPr>
       <w:r>
-        <w:t>It is tempting to think that an expansionist civilization needs only an open frontier to stay at peace, so that a new frontier—outer space, say—might drain its pressure and quiet its wars. I think this is half true, and the half that is false is instructive. The frontier such traditions crave is really two frontiers of different kinds. The material frontier is extensive: empty land and unused energy, a matter of volume that more space can enlarge. The spiritual frontier is intensive: it is aimed at particular souls and at the neighbor who believes otherwise, a matter of density, not volume. The two cannot be exchanged. You cannot discharge an intensive demand into an extensive supply, which is why the Age of Discovery flung open a vast material frontier and yet coincided with Europe's most terrible war of religion. Space enlarges only the extensive frontier; it leaves the mismatch untouched and may even amplify the intensive drive to carry one's own truth to the stars. If the heavens pacify anything, it will not be as an outlet but as a mirror—the view of the whole earth, undivided, that shrinks the tribal claim itself. And shrinking the claim is a reduction of demand, not an increase of supply.</w:t>
+        <w:t>It is tempting to think that an expansionist civilization needs only an open frontier to stay at peace, so that a new frontier—outer space, say—might drain its pressure and quiet its wars. I think this is half true, and the half that is false is instructive. The frontier such traditions crave is really two frontiers of different kinds. The material frontier is extensive: empty land and unused energy, a matter of volume that more space can enlarge. The spiritual frontier is intensive: it is aimed at particular souls and at the neighbor who believes otherwise, a matter of density, not volume. The two cannot be exchanged: an intensive demand cannot be discharged into an extensive supply. The pattern is suggestive rather than probative, but it is at least striking that the Age of Discovery flung open a vast material frontier and yet coincided with Europe's most terrible wars of religion. Space enlarges only the extensive frontier; it leaves the mismatch untouched and may even amplify the intensive drive to carry one's own truth to the stars. If the heavens pacify anything, it will not be as an outlet but as a mirror—the view of the whole earth, undivided, that shrinks the tribal claim itself. And shrinking the claim is a reduction of demand, not an increase of supply.</w:t>
       </w:r>
     </w:p>
     <w:p>
@@ -365,7 +365,7 @@
         <w:ind w:firstLine="576"/>
       </w:pPr>
       <w:r>
-        <w:t>The deepest prevention, then, is not a better weighing but a disciplined retreat from the posture of the one who weighs. We cannot reach the vanishing point at which no one need ever be placed on a scale; finitude forbids it. But we can decide which direction we face. Eighty years after Hiroshima, the question worth asking is not whether the bomb added up. It is whether we still wish to be the kind of beings who keep the books—or whether we might, at last, prefer to give in order to keep others alive rather than to take in order to live. That preference will not abolish tragedy. But it is the only ground on which a third world war becomes, not merely deterred, but unthinkable.</w:t>
+        <w:t>The deepest prevention, then, is not a better weighing but a disciplined retreat from the posture of the one who weighs. We cannot reach the vanishing point at which no one need ever be placed on a scale; finitude forbids it. But we can decide which direction we face. Eighty years after Hiroshima, the question worth asking is not whether the bomb added up. It is whether we still wish to be the kind of beings who keep the books—or whether we might, at last, prefer to give in order to keep others alive rather than to take in order to live. That preference will not abolish tragedy. But it is the ground on which a third world war might become, not merely deterred, but unthinkable.</w:t>
       </w:r>
     </w:p>
     <w:p>

</xml_diff>